<commit_message>
Atualização com setup-panel melhorado
</commit_message>
<xml_diff>
--- a/Relatório.docx
+++ b/Relatório.docx
@@ -15,7 +15,7 @@
           <w:noProof/>
         </w:rPr>
         <w:drawing>
-          <wp:anchor distT="0" distB="0" distL="114300" distR="114300" simplePos="0" relativeHeight="251661312" behindDoc="0" locked="0" layoutInCell="1" allowOverlap="1" wp14:anchorId="23DFDEB2" wp14:editId="634CCD84">
+          <wp:anchor distT="0" distB="0" distL="114300" distR="114300" simplePos="0" relativeHeight="251661312" behindDoc="0" locked="0" layoutInCell="1" allowOverlap="1" wp14:anchorId="23DFDEB2" wp14:editId="54896B6D">
             <wp:simplePos x="0" y="0"/>
             <wp:positionH relativeFrom="column">
               <wp:posOffset>1296035</wp:posOffset>
@@ -713,30 +713,29 @@
       <w:r>
         <w:rPr>
           <w:rFonts w:ascii="Arial" w:hAnsi="Arial" w:cs="Arial"/>
-          <w:noProof/>
           <w:lang w:val="pt-PT"/>
         </w:rPr>
         <w:drawing>
-          <wp:anchor distT="0" distB="0" distL="114300" distR="114300" simplePos="0" relativeHeight="251665408" behindDoc="1" locked="0" layoutInCell="1" allowOverlap="1" wp14:anchorId="1C9A46E8" wp14:editId="55FDE1F5">
+          <wp:anchor distT="0" distB="0" distL="114300" distR="114300" simplePos="0" relativeHeight="251665408" behindDoc="1" locked="0" layoutInCell="1" allowOverlap="1" wp14:anchorId="046653CD" wp14:editId="73477FE2">
             <wp:simplePos x="0" y="0"/>
             <wp:positionH relativeFrom="margin">
-              <wp:posOffset>1369060</wp:posOffset>
+              <wp:posOffset>1673860</wp:posOffset>
             </wp:positionH>
             <wp:positionV relativeFrom="paragraph">
-              <wp:posOffset>811530</wp:posOffset>
+              <wp:posOffset>849630</wp:posOffset>
             </wp:positionV>
-            <wp:extent cx="4067175" cy="3390900"/>
-            <wp:effectExtent l="0" t="0" r="9525" b="0"/>
+            <wp:extent cx="4335145" cy="3924300"/>
+            <wp:effectExtent l="0" t="0" r="8255" b="0"/>
             <wp:wrapTight wrapText="bothSides">
               <wp:wrapPolygon edited="0">
                 <wp:start x="0" y="0"/>
-                <wp:lineTo x="0" y="21479"/>
-                <wp:lineTo x="21549" y="21479"/>
-                <wp:lineTo x="21549" y="0"/>
+                <wp:lineTo x="0" y="21495"/>
+                <wp:lineTo x="21546" y="21495"/>
+                <wp:lineTo x="21546" y="0"/>
                 <wp:lineTo x="0" y="0"/>
               </wp:wrapPolygon>
             </wp:wrapTight>
-            <wp:docPr id="26223236" name="Imagem 1"/>
+            <wp:docPr id="1751936491" name="Picture 1"/>
             <wp:cNvGraphicFramePr>
               <a:graphicFrameLocks xmlns:a="http://schemas.openxmlformats.org/drawingml/2006/main" noChangeAspect="1"/>
             </wp:cNvGraphicFramePr>
@@ -744,7 +743,7 @@
               <a:graphicData uri="http://schemas.openxmlformats.org/drawingml/2006/picture">
                 <pic:pic xmlns:pic="http://schemas.openxmlformats.org/drawingml/2006/picture">
                   <pic:nvPicPr>
-                    <pic:cNvPr id="26223236" name=""/>
+                    <pic:cNvPr id="1751936491" name=""/>
                     <pic:cNvPicPr/>
                   </pic:nvPicPr>
                   <pic:blipFill>
@@ -762,7 +761,7 @@
                   <pic:spPr>
                     <a:xfrm>
                       <a:off x="0" y="0"/>
-                      <a:ext cx="4067175" cy="3390900"/>
+                      <a:ext cx="4335145" cy="3924300"/>
                     </a:xfrm>
                     <a:prstGeom prst="rect">
                       <a:avLst/>
@@ -852,7 +851,23 @@
           <w:rFonts w:ascii="Arial" w:hAnsi="Arial" w:cs="Arial"/>
           <w:lang w:val="pt-PT"/>
         </w:rPr>
-        <w:t xml:space="preserve"> uma arquitetura modular baseada em componentes funcionais. Respeitando a proibição de concentrar toda a gestão de estados no componente central App.jsx, </w:t>
+        <w:t xml:space="preserve"> uma arquitetura modular baseada em componentes funcionais. Respeitando a proibição de concentrar toda a gestão de estados no componente central </w:t>
+      </w:r>
+      <w:proofErr w:type="spellStart"/>
+      <w:r>
+        <w:rPr>
+          <w:rFonts w:ascii="Arial" w:hAnsi="Arial" w:cs="Arial"/>
+          <w:lang w:val="pt-PT"/>
+        </w:rPr>
+        <w:t>App.jsx</w:t>
+      </w:r>
+      <w:proofErr w:type="spellEnd"/>
+      <w:r>
+        <w:rPr>
+          <w:rFonts w:ascii="Arial" w:hAnsi="Arial" w:cs="Arial"/>
+          <w:lang w:val="pt-PT"/>
+        </w:rPr>
+        <w:t xml:space="preserve">, </w:t>
       </w:r>
       <w:r>
         <w:rPr>
@@ -866,7 +881,23 @@
           <w:rFonts w:ascii="Arial" w:hAnsi="Arial" w:cs="Arial"/>
           <w:lang w:val="pt-PT"/>
         </w:rPr>
-        <w:t>telemetria do tempo para o ControlPanel. O</w:t>
+        <w:t xml:space="preserve">telemetria do tempo para o </w:t>
+      </w:r>
+      <w:proofErr w:type="spellStart"/>
+      <w:r>
+        <w:rPr>
+          <w:rFonts w:ascii="Arial" w:hAnsi="Arial" w:cs="Arial"/>
+          <w:lang w:val="pt-PT"/>
+        </w:rPr>
+        <w:t>ControlPanel</w:t>
+      </w:r>
+      <w:proofErr w:type="spellEnd"/>
+      <w:r>
+        <w:rPr>
+          <w:rFonts w:ascii="Arial" w:hAnsi="Arial" w:cs="Arial"/>
+          <w:lang w:val="pt-PT"/>
+        </w:rPr>
+        <w:t>. O</w:t>
       </w:r>
       <w:r>
         <w:rPr>
@@ -880,7 +911,39 @@
           <w:rFonts w:ascii="Arial" w:hAnsi="Arial" w:cs="Arial"/>
           <w:lang w:val="pt-PT"/>
         </w:rPr>
-        <w:t xml:space="preserve"> fluxo de dados de forma descendente, com callbacks a garantir a sincronização entre irmãos sem recurso ao Context API.</w:t>
+        <w:t xml:space="preserve"> fluxo de dados de forma descendente, com </w:t>
+      </w:r>
+      <w:proofErr w:type="spellStart"/>
+      <w:r>
+        <w:rPr>
+          <w:rFonts w:ascii="Arial" w:hAnsi="Arial" w:cs="Arial"/>
+          <w:lang w:val="pt-PT"/>
+        </w:rPr>
+        <w:t>callbacks</w:t>
+      </w:r>
+      <w:proofErr w:type="spellEnd"/>
+      <w:r>
+        <w:rPr>
+          <w:rFonts w:ascii="Arial" w:hAnsi="Arial" w:cs="Arial"/>
+          <w:lang w:val="pt-PT"/>
+        </w:rPr>
+        <w:t xml:space="preserve"> a garantir a sincronização entre irmãos sem recurso ao </w:t>
+      </w:r>
+      <w:proofErr w:type="spellStart"/>
+      <w:r>
+        <w:rPr>
+          <w:rFonts w:ascii="Arial" w:hAnsi="Arial" w:cs="Arial"/>
+          <w:lang w:val="pt-PT"/>
+        </w:rPr>
+        <w:t>Context</w:t>
+      </w:r>
+      <w:proofErr w:type="spellEnd"/>
+      <w:r>
+        <w:rPr>
+          <w:rFonts w:ascii="Arial" w:hAnsi="Arial" w:cs="Arial"/>
+          <w:lang w:val="pt-PT"/>
+        </w:rPr>
+        <w:t xml:space="preserve"> API.</w:t>
       </w:r>
     </w:p>
     <w:p>
@@ -1083,6 +1146,7 @@
           <w:lang w:val="pt-PT"/>
         </w:rPr>
       </w:pPr>
+      <w:proofErr w:type="spellStart"/>
       <w:r>
         <w:rPr>
           <w:rFonts w:ascii="Arial" w:hAnsi="Arial" w:cs="Arial"/>
@@ -1092,6 +1156,7 @@
         </w:rPr>
         <w:t>App.jsx</w:t>
       </w:r>
+      <w:proofErr w:type="spellEnd"/>
       <w:r>
         <w:rPr>
           <w:rFonts w:ascii="Arial" w:hAnsi="Arial" w:cs="Arial"/>
@@ -1112,6 +1177,7 @@
           <w:lang w:val="pt-PT"/>
         </w:rPr>
       </w:pPr>
+      <w:proofErr w:type="spellStart"/>
       <w:r>
         <w:rPr>
           <w:rFonts w:ascii="Arial" w:hAnsi="Arial" w:cs="Arial"/>
@@ -1121,6 +1187,7 @@
         </w:rPr>
         <w:t>SetupPanel</w:t>
       </w:r>
+      <w:proofErr w:type="spellEnd"/>
       <w:r>
         <w:rPr>
           <w:rFonts w:ascii="Arial" w:hAnsi="Arial" w:cs="Arial"/>
@@ -1141,6 +1208,7 @@
           <w:lang w:val="pt-PT"/>
         </w:rPr>
       </w:pPr>
+      <w:proofErr w:type="spellStart"/>
       <w:r>
         <w:rPr>
           <w:rFonts w:ascii="Arial" w:hAnsi="Arial" w:cs="Arial"/>
@@ -1150,12 +1218,29 @@
         </w:rPr>
         <w:t>ControlPanel</w:t>
       </w:r>
-      <w:r>
-        <w:rPr>
-          <w:rFonts w:ascii="Arial" w:hAnsi="Arial" w:cs="Arial"/>
-          <w:lang w:val="pt-PT"/>
-        </w:rPr>
-        <w:t>: Gere, através de estado local, o temporizador da partida, pausando e reiniciando autonomamente através do ciclo de vida ditado pelas mudanças de turno. Emite eventos de penalização de Timeout.</w:t>
+      <w:proofErr w:type="spellEnd"/>
+      <w:r>
+        <w:rPr>
+          <w:rFonts w:ascii="Arial" w:hAnsi="Arial" w:cs="Arial"/>
+          <w:lang w:val="pt-PT"/>
+        </w:rPr>
+        <w:t xml:space="preserve">: Gere, através de estado local, o temporizador da partida, pausando e reiniciando autonomamente através do ciclo de vida ditado pelas mudanças de turno. Emite eventos de penalização de </w:t>
+      </w:r>
+      <w:proofErr w:type="spellStart"/>
+      <w:r>
+        <w:rPr>
+          <w:rFonts w:ascii="Arial" w:hAnsi="Arial" w:cs="Arial"/>
+          <w:lang w:val="pt-PT"/>
+        </w:rPr>
+        <w:t>Timeout</w:t>
+      </w:r>
+      <w:proofErr w:type="spellEnd"/>
+      <w:r>
+        <w:rPr>
+          <w:rFonts w:ascii="Arial" w:hAnsi="Arial" w:cs="Arial"/>
+          <w:lang w:val="pt-PT"/>
+        </w:rPr>
+        <w:t>.</w:t>
       </w:r>
     </w:p>
     <w:p>
@@ -1170,6 +1255,7 @@
           <w:lang w:val="pt-PT"/>
         </w:rPr>
       </w:pPr>
+      <w:proofErr w:type="spellStart"/>
       <w:r>
         <w:rPr>
           <w:rFonts w:ascii="Arial" w:hAnsi="Arial" w:cs="Arial"/>
@@ -1177,14 +1263,51 @@
           <w:bCs/>
           <w:lang w:val="pt-PT"/>
         </w:rPr>
-        <w:t>GameBoard e Cell</w:t>
-      </w:r>
-      <w:r>
-        <w:rPr>
-          <w:rFonts w:ascii="Arial" w:hAnsi="Arial" w:cs="Arial"/>
-          <w:lang w:val="pt-PT"/>
-        </w:rPr>
-        <w:t>: Aplicam formatações dinâmicas a áreas 2x2 mediante propósitos de radar e controlam a revelação de células durante o Debug.</w:t>
+        <w:t>GameBoard</w:t>
+      </w:r>
+      <w:proofErr w:type="spellEnd"/>
+      <w:r>
+        <w:rPr>
+          <w:rFonts w:ascii="Arial" w:hAnsi="Arial" w:cs="Arial"/>
+          <w:b/>
+          <w:bCs/>
+          <w:lang w:val="pt-PT"/>
+        </w:rPr>
+        <w:t xml:space="preserve"> e </w:t>
+      </w:r>
+      <w:proofErr w:type="spellStart"/>
+      <w:r>
+        <w:rPr>
+          <w:rFonts w:ascii="Arial" w:hAnsi="Arial" w:cs="Arial"/>
+          <w:b/>
+          <w:bCs/>
+          <w:lang w:val="pt-PT"/>
+        </w:rPr>
+        <w:t>Cell</w:t>
+      </w:r>
+      <w:proofErr w:type="spellEnd"/>
+      <w:r>
+        <w:rPr>
+          <w:rFonts w:ascii="Arial" w:hAnsi="Arial" w:cs="Arial"/>
+          <w:lang w:val="pt-PT"/>
+        </w:rPr>
+        <w:t xml:space="preserve">: Aplicam formatações dinâmicas a áreas 2x2 mediante propósitos de radar e controlam a revelação de células durante o </w:t>
+      </w:r>
+      <w:proofErr w:type="spellStart"/>
+      <w:r>
+        <w:rPr>
+          <w:rFonts w:ascii="Arial" w:hAnsi="Arial" w:cs="Arial"/>
+          <w:lang w:val="pt-PT"/>
+        </w:rPr>
+        <w:t>Debug</w:t>
+      </w:r>
+      <w:proofErr w:type="spellEnd"/>
+      <w:r>
+        <w:rPr>
+          <w:rFonts w:ascii="Arial" w:hAnsi="Arial" w:cs="Arial"/>
+          <w:lang w:val="pt-PT"/>
+        </w:rPr>
+        <w:t>.</w:t>
       </w:r>
     </w:p>
     <w:p>
@@ -1199,6 +1322,7 @@
           <w:lang w:val="pt-PT"/>
         </w:rPr>
       </w:pPr>
+      <w:proofErr w:type="spellStart"/>
       <w:r>
         <w:rPr>
           <w:rFonts w:ascii="Arial" w:hAnsi="Arial" w:cs="Arial"/>
@@ -1208,12 +1332,45 @@
         </w:rPr>
         <w:t>GameOverModal</w:t>
       </w:r>
-      <w:r>
-        <w:rPr>
-          <w:rFonts w:ascii="Arial" w:hAnsi="Arial" w:cs="Arial"/>
-          <w:lang w:val="pt-PT"/>
-        </w:rPr>
-        <w:t>: Apresenta resultados e implementa função de reset de estados React.</w:t>
+      <w:proofErr w:type="spellEnd"/>
+      <w:r>
+        <w:rPr>
+          <w:rFonts w:ascii="Arial" w:hAnsi="Arial" w:cs="Arial"/>
+          <w:lang w:val="pt-PT"/>
+        </w:rPr>
+        <w:t xml:space="preserve">: Apresenta resultados e implementa função de </w:t>
+      </w:r>
+      <w:proofErr w:type="spellStart"/>
+      <w:r>
+        <w:rPr>
+          <w:rFonts w:ascii="Arial" w:hAnsi="Arial" w:cs="Arial"/>
+          <w:lang w:val="pt-PT"/>
+        </w:rPr>
+        <w:t>reset</w:t>
+      </w:r>
+      <w:proofErr w:type="spellEnd"/>
+      <w:r>
+        <w:rPr>
+          <w:rFonts w:ascii="Arial" w:hAnsi="Arial" w:cs="Arial"/>
+          <w:lang w:val="pt-PT"/>
+        </w:rPr>
+        <w:t xml:space="preserve"> de estados </w:t>
+      </w:r>
+      <w:proofErr w:type="spellStart"/>
+      <w:r>
+        <w:rPr>
+          <w:rFonts w:ascii="Arial" w:hAnsi="Arial" w:cs="Arial"/>
+          <w:lang w:val="pt-PT"/>
+        </w:rPr>
+        <w:t>React</w:t>
+      </w:r>
+      <w:proofErr w:type="spellEnd"/>
+      <w:r>
+        <w:rPr>
+          <w:rFonts w:ascii="Arial" w:hAnsi="Arial" w:cs="Arial"/>
+          <w:lang w:val="pt-PT"/>
+        </w:rPr>
+        <w:t>.</w:t>
       </w:r>
     </w:p>
     <w:p>
@@ -1303,7 +1460,55 @@
           <w:rFonts w:ascii="Arial" w:hAnsi="Arial" w:cs="Arial"/>
           <w:lang w:val="pt-PT"/>
         </w:rPr>
-        <w:t xml:space="preserve"> o App.jsx com cálculos de milissegundos que forçam atualizações da UI completa, a lógica de contagem e gestão do tempo de turno reside localmente no ControlPanel. O painel informa a camada pai unicamente quando o tempo expira, otimizando o rendering.</w:t>
+        <w:t xml:space="preserve"> o </w:t>
+      </w:r>
+      <w:proofErr w:type="spellStart"/>
+      <w:r>
+        <w:rPr>
+          <w:rFonts w:ascii="Arial" w:hAnsi="Arial" w:cs="Arial"/>
+          <w:lang w:val="pt-PT"/>
+        </w:rPr>
+        <w:t>App.jsx</w:t>
+      </w:r>
+      <w:proofErr w:type="spellEnd"/>
+      <w:r>
+        <w:rPr>
+          <w:rFonts w:ascii="Arial" w:hAnsi="Arial" w:cs="Arial"/>
+          <w:lang w:val="pt-PT"/>
+        </w:rPr>
+        <w:t xml:space="preserve"> com cálculos de milissegundos que forçam atualizações da UI completa, a lógica de contagem e gestão do tempo de turno reside localmente no </w:t>
+      </w:r>
+      <w:proofErr w:type="spellStart"/>
+      <w:r>
+        <w:rPr>
+          <w:rFonts w:ascii="Arial" w:hAnsi="Arial" w:cs="Arial"/>
+          <w:lang w:val="pt-PT"/>
+        </w:rPr>
+        <w:t>ControlPanel</w:t>
+      </w:r>
+      <w:proofErr w:type="spellEnd"/>
+      <w:r>
+        <w:rPr>
+          <w:rFonts w:ascii="Arial" w:hAnsi="Arial" w:cs="Arial"/>
+          <w:lang w:val="pt-PT"/>
+        </w:rPr>
+        <w:t xml:space="preserve">. O painel informa a camada pai unicamente quando o tempo expira, otimizando o </w:t>
+      </w:r>
+      <w:proofErr w:type="spellStart"/>
+      <w:r>
+        <w:rPr>
+          <w:rFonts w:ascii="Arial" w:hAnsi="Arial" w:cs="Arial"/>
+          <w:lang w:val="pt-PT"/>
+        </w:rPr>
+        <w:t>rendering</w:t>
+      </w:r>
+      <w:proofErr w:type="spellEnd"/>
+      <w:r>
+        <w:rPr>
+          <w:rFonts w:ascii="Arial" w:hAnsi="Arial" w:cs="Arial"/>
+          <w:lang w:val="pt-PT"/>
+        </w:rPr>
+        <w:t>.</w:t>
       </w:r>
     </w:p>
     <w:p>
@@ -1332,7 +1537,23 @@
           <w:rFonts w:ascii="Arial" w:hAnsi="Arial" w:cs="Arial"/>
           <w:lang w:val="pt-PT"/>
         </w:rPr>
-        <w:t xml:space="preserve"> Através da passagem de um objeto de coordenadas como propriedade radarArea para a grelha, o tabuleiro calcula se o índice atual da iteração de células se cruza com a caixa envolvente delimitada pelo Radar, modificando o CSS da matriz.</w:t>
+        <w:t xml:space="preserve"> Através da passagem de um objeto de coordenadas como propriedade </w:t>
+      </w:r>
+      <w:proofErr w:type="spellStart"/>
+      <w:r>
+        <w:rPr>
+          <w:rFonts w:ascii="Arial" w:hAnsi="Arial" w:cs="Arial"/>
+          <w:lang w:val="pt-PT"/>
+        </w:rPr>
+        <w:t>radarArea</w:t>
+      </w:r>
+      <w:proofErr w:type="spellEnd"/>
+      <w:r>
+        <w:rPr>
+          <w:rFonts w:ascii="Arial" w:hAnsi="Arial" w:cs="Arial"/>
+          <w:lang w:val="pt-PT"/>
+        </w:rPr>
+        <w:t xml:space="preserve"> para a grelha, o tabuleiro calcula se o índice atual da iteração de células se cruza com a caixa envolvente delimitada pelo Radar, modificando o CSS da matriz.</w:t>
       </w:r>
     </w:p>
     <w:p>
@@ -1354,7 +1575,27 @@
           <w:bCs/>
           <w:lang w:val="pt-PT"/>
         </w:rPr>
-        <w:t>Limpeza Pura de Memória React:</w:t>
+        <w:t xml:space="preserve">Limpeza Pura de Memória </w:t>
+      </w:r>
+      <w:proofErr w:type="spellStart"/>
+      <w:r>
+        <w:rPr>
+          <w:rFonts w:ascii="Arial" w:hAnsi="Arial" w:cs="Arial"/>
+          <w:b/>
+          <w:bCs/>
+          <w:lang w:val="pt-PT"/>
+        </w:rPr>
+        <w:t>React</w:t>
+      </w:r>
+      <w:proofErr w:type="spellEnd"/>
+      <w:r>
+        <w:rPr>
+          <w:rFonts w:ascii="Arial" w:hAnsi="Arial" w:cs="Arial"/>
+          <w:b/>
+          <w:bCs/>
+          <w:lang w:val="pt-PT"/>
+        </w:rPr>
+        <w:t>:</w:t>
       </w:r>
       <w:r>
         <w:rPr>
@@ -1375,7 +1616,39 @@
           <w:rFonts w:ascii="Arial" w:hAnsi="Arial" w:cs="Arial"/>
           <w:lang w:val="pt-PT"/>
         </w:rPr>
-        <w:t xml:space="preserve"> useRef e coloca todos os Arrays vazios num único ciclo.</w:t>
+        <w:t xml:space="preserve"> </w:t>
+      </w:r>
+      <w:proofErr w:type="spellStart"/>
+      <w:r>
+        <w:rPr>
+          <w:rFonts w:ascii="Arial" w:hAnsi="Arial" w:cs="Arial"/>
+          <w:lang w:val="pt-PT"/>
+        </w:rPr>
+        <w:t>useRef</w:t>
+      </w:r>
+      <w:proofErr w:type="spellEnd"/>
+      <w:r>
+        <w:rPr>
+          <w:rFonts w:ascii="Arial" w:hAnsi="Arial" w:cs="Arial"/>
+          <w:lang w:val="pt-PT"/>
+        </w:rPr>
+        <w:t xml:space="preserve"> e coloca todos os </w:t>
+      </w:r>
+      <w:proofErr w:type="spellStart"/>
+      <w:r>
+        <w:rPr>
+          <w:rFonts w:ascii="Arial" w:hAnsi="Arial" w:cs="Arial"/>
+          <w:lang w:val="pt-PT"/>
+        </w:rPr>
+        <w:t>Arrays</w:t>
+      </w:r>
+      <w:proofErr w:type="spellEnd"/>
+      <w:r>
+        <w:rPr>
+          <w:rFonts w:ascii="Arial" w:hAnsi="Arial" w:cs="Arial"/>
+          <w:lang w:val="pt-PT"/>
+        </w:rPr>
+        <w:t xml:space="preserve"> vazios num único ciclo.</w:t>
       </w:r>
       <w:r>
         <w:rPr>

</xml_diff>